<commit_message>
final description of lab_02
</commit_message>
<xml_diff>
--- a/vivado_projects/lab_02_hierarchy/doc/Hierarchy.docx
+++ b/vivado_projects/lab_02_hierarchy/doc/Hierarchy.docx
@@ -77,10 +77,11 @@
           <w:r>
             <w:fldChar w:fldCharType="separate"/>
           </w:r>
-          <w:hyperlink w:anchor="_Toc234854321" w:history="1">
+          <w:hyperlink w:anchor="_Toc234932885" w:history="1">
             <w:r>
               <w:rPr>
                 <w:rStyle w:val="Hyperlink"/>
+                <w:lang w:val="uk-UA"/>
               </w:rPr>
               <w:t>1</w:t>
             </w:r>
@@ -99,8 +100,9 @@
             <w:r>
               <w:rPr>
                 <w:rStyle w:val="Hyperlink"/>
+                <w:lang w:val="uk-UA"/>
               </w:rPr>
-              <w:t>Theory</w:t>
+              <w:t>Мета та завдання</w:t>
             </w:r>
             <w:r>
               <w:rPr>
@@ -118,7 +120,7 @@
               <w:rPr>
                 <w:webHidden/>
               </w:rPr>
-              <w:instrText xml:space="preserve"> PAGEREF _Toc234854321 \h </w:instrText>
+              <w:instrText xml:space="preserve"> PAGEREF _Toc234932885 \h </w:instrText>
             </w:r>
             <w:r>
               <w:rPr>
@@ -158,7 +160,7 @@
               <w14:ligatures w14:val="standardContextual"/>
             </w:rPr>
           </w:pPr>
-          <w:hyperlink w:anchor="_Toc234854322" w:history="1">
+          <w:hyperlink w:anchor="_Toc234932886" w:history="1">
             <w:r>
               <w:rPr>
                 <w:rStyle w:val="Hyperlink"/>
@@ -181,7 +183,7 @@
               <w:rPr>
                 <w:rStyle w:val="Hyperlink"/>
               </w:rPr>
-              <w:t>Clocking Wizard usage</w:t>
+              <w:t>Theory</w:t>
             </w:r>
             <w:r>
               <w:rPr>
@@ -199,7 +201,7 @@
               <w:rPr>
                 <w:webHidden/>
               </w:rPr>
-              <w:instrText xml:space="preserve"> PAGEREF _Toc234854322 \h </w:instrText>
+              <w:instrText xml:space="preserve"> PAGEREF _Toc234932886 \h </w:instrText>
             </w:r>
             <w:r>
               <w:rPr>
@@ -216,7 +218,183 @@
               <w:rPr>
                 <w:webHidden/>
               </w:rPr>
-              <w:t>5</w:t>
+              <w:t>3</w:t>
+            </w:r>
+            <w:r>
+              <w:rPr>
+                <w:webHidden/>
+              </w:rPr>
+              <w:fldChar w:fldCharType="end"/>
+            </w:r>
+          </w:hyperlink>
+        </w:p>
+        <w:p>
+          <w:pPr>
+            <w:pStyle w:val="TOC1"/>
+            <w:rPr>
+              <w:rFonts w:asciiTheme="minorHAnsi" w:eastAsiaTheme="minorEastAsia" w:hAnsiTheme="minorHAnsi" w:cstheme="minorBidi"/>
+              <w:b w:val="0"/>
+              <w:kern w:val="2"/>
+              <w:sz w:val="24"/>
+              <w:szCs w:val="24"/>
+              <w:lang w:val="uk-UA" w:eastAsia="uk-UA"/>
+              <w14:ligatures w14:val="standardContextual"/>
+            </w:rPr>
+          </w:pPr>
+          <w:hyperlink w:anchor="_Toc234932887" w:history="1">
+            <w:r>
+              <w:rPr>
+                <w:rStyle w:val="Hyperlink"/>
+              </w:rPr>
+              <w:t>3</w:t>
+            </w:r>
+            <w:r>
+              <w:rPr>
+                <w:rFonts w:asciiTheme="minorHAnsi" w:eastAsiaTheme="minorEastAsia" w:hAnsiTheme="minorHAnsi" w:cstheme="minorBidi"/>
+                <w:b w:val="0"/>
+                <w:kern w:val="2"/>
+                <w:sz w:val="24"/>
+                <w:szCs w:val="24"/>
+                <w:lang w:val="uk-UA" w:eastAsia="uk-UA"/>
+                <w14:ligatures w14:val="standardContextual"/>
+              </w:rPr>
+              <w:tab/>
+            </w:r>
+            <w:r>
+              <w:rPr>
+                <w:rStyle w:val="Hyperlink"/>
+              </w:rPr>
+              <w:t>Simulati</w:t>
+            </w:r>
+            <w:r>
+              <w:rPr>
+                <w:rStyle w:val="Hyperlink"/>
+              </w:rPr>
+              <w:t>o</w:t>
+            </w:r>
+            <w:r>
+              <w:rPr>
+                <w:rStyle w:val="Hyperlink"/>
+              </w:rPr>
+              <w:t>n results</w:t>
+            </w:r>
+            <w:r>
+              <w:rPr>
+                <w:webHidden/>
+              </w:rPr>
+              <w:tab/>
+            </w:r>
+            <w:r>
+              <w:rPr>
+                <w:webHidden/>
+              </w:rPr>
+              <w:fldChar w:fldCharType="begin"/>
+            </w:r>
+            <w:r>
+              <w:rPr>
+                <w:webHidden/>
+              </w:rPr>
+              <w:instrText xml:space="preserve"> PAGEREF _Toc234932887 \h </w:instrText>
+            </w:r>
+            <w:r>
+              <w:rPr>
+                <w:webHidden/>
+              </w:rPr>
+            </w:r>
+            <w:r>
+              <w:rPr>
+                <w:webHidden/>
+              </w:rPr>
+              <w:fldChar w:fldCharType="separate"/>
+            </w:r>
+            <w:r>
+              <w:rPr>
+                <w:webHidden/>
+              </w:rPr>
+              <w:t>4</w:t>
+            </w:r>
+            <w:r>
+              <w:rPr>
+                <w:webHidden/>
+              </w:rPr>
+              <w:fldChar w:fldCharType="end"/>
+            </w:r>
+          </w:hyperlink>
+        </w:p>
+        <w:p>
+          <w:pPr>
+            <w:pStyle w:val="TOC1"/>
+            <w:rPr>
+              <w:rFonts w:asciiTheme="minorHAnsi" w:eastAsiaTheme="minorEastAsia" w:hAnsiTheme="minorHAnsi" w:cstheme="minorBidi"/>
+              <w:b w:val="0"/>
+              <w:kern w:val="2"/>
+              <w:sz w:val="24"/>
+              <w:szCs w:val="24"/>
+              <w:lang w:val="uk-UA" w:eastAsia="uk-UA"/>
+              <w14:ligatures w14:val="standardContextual"/>
+            </w:rPr>
+          </w:pPr>
+          <w:hyperlink w:anchor="_Toc234932888" w:history="1">
+            <w:r>
+              <w:rPr>
+                <w:rStyle w:val="Hyperlink"/>
+                <w:lang w:val="uk-UA"/>
+              </w:rPr>
+              <w:t>4</w:t>
+            </w:r>
+            <w:r>
+              <w:rPr>
+                <w:rFonts w:asciiTheme="minorHAnsi" w:eastAsiaTheme="minorEastAsia" w:hAnsiTheme="minorHAnsi" w:cstheme="minorBidi"/>
+                <w:b w:val="0"/>
+                <w:kern w:val="2"/>
+                <w:sz w:val="24"/>
+                <w:szCs w:val="24"/>
+                <w:lang w:val="uk-UA" w:eastAsia="uk-UA"/>
+                <w14:ligatures w14:val="standardContextual"/>
+              </w:rPr>
+              <w:tab/>
+            </w:r>
+            <w:r>
+              <w:rPr>
+                <w:rStyle w:val="Hyperlink"/>
+                <w:lang w:val="uk-UA"/>
+              </w:rPr>
+              <w:t>Індивідуальні завдання</w:t>
+            </w:r>
+            <w:r>
+              <w:rPr>
+                <w:webHidden/>
+              </w:rPr>
+              <w:tab/>
+            </w:r>
+            <w:r>
+              <w:rPr>
+                <w:webHidden/>
+              </w:rPr>
+              <w:fldChar w:fldCharType="begin"/>
+            </w:r>
+            <w:r>
+              <w:rPr>
+                <w:webHidden/>
+              </w:rPr>
+              <w:instrText xml:space="preserve"> PAGEREF _Toc234932888 \h </w:instrText>
+            </w:r>
+            <w:r>
+              <w:rPr>
+                <w:webHidden/>
+              </w:rPr>
+            </w:r>
+            <w:r>
+              <w:rPr>
+                <w:webHidden/>
+              </w:rPr>
+              <w:fldChar w:fldCharType="separate"/>
+            </w:r>
+            <w:r>
+              <w:rPr>
+                <w:webHidden/>
+              </w:rPr>
+              <w:t>6</w:t>
             </w:r>
             <w:r>
               <w:rPr>
@@ -246,7 +424,7 @@
           <w:lang w:val="uk-UA"/>
         </w:rPr>
       </w:pPr>
-      <w:bookmarkStart w:id="0" w:name="_Toc234854321"/>
+      <w:bookmarkStart w:id="0" w:name="_Toc234932885"/>
       <w:r>
         <w:rPr>
           <w:lang w:val="uk-UA"/>
@@ -254,6 +432,7 @@
         <w:lastRenderedPageBreak/>
         <w:t>Мета та завдання</w:t>
       </w:r>
+      <w:bookmarkEnd w:id="0"/>
     </w:p>
     <w:p>
       <w:pPr>
@@ -265,26 +444,27 @@
     </w:p>
     <w:p>
       <w:pPr>
-        <w:pStyle w:val="Heading2"/>
-        <w:rPr>
-          <w:b w:val="0"/>
+        <w:jc w:val="center"/>
+        <w:rPr>
+          <w:b/>
+          <w:bCs/>
+          <w:sz w:val="28"/>
+          <w:szCs w:val="28"/>
           <w:lang w:val="uk-UA"/>
         </w:rPr>
       </w:pPr>
       <w:bookmarkStart w:id="1" w:name="_Toc93516729"/>
       <w:r>
         <w:rPr>
+          <w:b/>
+          <w:bCs/>
+          <w:sz w:val="28"/>
+          <w:szCs w:val="28"/>
           <w:lang w:val="uk-UA"/>
         </w:rPr>
         <w:t>Мета</w:t>
       </w:r>
       <w:bookmarkEnd w:id="1"/>
-      <w:r>
-        <w:rPr>
-          <w:lang w:val="uk-UA"/>
-        </w:rPr>
-        <w:t xml:space="preserve"> </w:t>
-      </w:r>
     </w:p>
     <w:p>
       <w:pPr>
@@ -311,7 +491,23 @@
           <w:rFonts w:ascii="Times New Roman" w:hAnsi="Times New Roman"/>
           <w:lang w:val="uk-UA"/>
         </w:rPr>
-        <w:t>, що є невід’ємною частиною великих проектів.</w:t>
+        <w:t xml:space="preserve">, що є невід’ємною частиною великих </w:t>
+      </w:r>
+      <w:proofErr w:type="spellStart"/>
+      <w:r>
+        <w:rPr>
+          <w:rFonts w:ascii="Times New Roman" w:hAnsi="Times New Roman"/>
+          <w:lang w:val="uk-UA"/>
+        </w:rPr>
+        <w:t>проектів</w:t>
+      </w:r>
+      <w:proofErr w:type="spellEnd"/>
+      <w:r>
+        <w:rPr>
+          <w:rFonts w:ascii="Times New Roman" w:hAnsi="Times New Roman"/>
+          <w:lang w:val="uk-UA"/>
+        </w:rPr>
+        <w:t>.</w:t>
       </w:r>
     </w:p>
     <w:p>
@@ -323,26 +519,27 @@
     </w:p>
     <w:p>
       <w:pPr>
-        <w:pStyle w:val="Heading2"/>
-        <w:rPr>
-          <w:b w:val="0"/>
+        <w:jc w:val="center"/>
+        <w:rPr>
+          <w:b/>
+          <w:bCs/>
+          <w:sz w:val="24"/>
+          <w:szCs w:val="24"/>
           <w:lang w:val="uk-UA"/>
         </w:rPr>
       </w:pPr>
       <w:bookmarkStart w:id="2" w:name="_Toc93516730"/>
       <w:r>
         <w:rPr>
+          <w:b/>
+          <w:bCs/>
+          <w:sz w:val="24"/>
+          <w:szCs w:val="24"/>
           <w:lang w:val="uk-UA"/>
         </w:rPr>
         <w:t>Теоретичні відомості.</w:t>
       </w:r>
       <w:bookmarkEnd w:id="2"/>
-      <w:r>
-        <w:rPr>
-          <w:lang w:val="uk-UA"/>
-        </w:rPr>
-        <w:t xml:space="preserve"> </w:t>
-      </w:r>
     </w:p>
     <w:p>
       <w:pPr>
@@ -370,7 +567,23 @@
           <w:rFonts w:ascii="Times New Roman" w:hAnsi="Times New Roman"/>
           <w:lang w:val="uk-UA"/>
         </w:rPr>
-        <w:t xml:space="preserve"> модулі, а ці в свою чергу модулі ще нижчого рівня ієрархії і т.д. Модуль самого верхнього рівня часто називають </w:t>
+        <w:t xml:space="preserve"> модулі, а ці в свою чергу модулі ще нижчого рівня ієрархії і </w:t>
+      </w:r>
+      <w:proofErr w:type="spellStart"/>
+      <w:r>
+        <w:rPr>
+          <w:rFonts w:ascii="Times New Roman" w:hAnsi="Times New Roman"/>
+          <w:lang w:val="uk-UA"/>
+        </w:rPr>
+        <w:t>т.д</w:t>
+      </w:r>
+      <w:proofErr w:type="spellEnd"/>
+      <w:r>
+        <w:rPr>
+          <w:rFonts w:ascii="Times New Roman" w:hAnsi="Times New Roman"/>
+          <w:lang w:val="uk-UA"/>
+        </w:rPr>
+        <w:t xml:space="preserve">. Модуль самого верхнього рівня часто називають </w:t>
       </w:r>
       <w:r>
         <w:rPr>
@@ -440,7 +653,23 @@
           <w:rFonts w:ascii="Times New Roman" w:hAnsi="Times New Roman"/>
           <w:lang w:val="uk-UA"/>
         </w:rPr>
-        <w:t xml:space="preserve">Нижче показано з’днання модулів </w:t>
+        <w:t xml:space="preserve">Нижче показано </w:t>
+      </w:r>
+      <w:proofErr w:type="spellStart"/>
+      <w:r>
+        <w:rPr>
+          <w:rFonts w:ascii="Times New Roman" w:hAnsi="Times New Roman"/>
+          <w:lang w:val="uk-UA"/>
+        </w:rPr>
+        <w:t>з’днання</w:t>
+      </w:r>
+      <w:proofErr w:type="spellEnd"/>
+      <w:r>
+        <w:rPr>
+          <w:rFonts w:ascii="Times New Roman" w:hAnsi="Times New Roman"/>
+          <w:lang w:val="uk-UA"/>
+        </w:rPr>
+        <w:t xml:space="preserve"> модулів </w:t>
       </w:r>
       <w:r>
         <w:rPr>
@@ -559,7 +788,23 @@
           <w:rFonts w:ascii="Times New Roman" w:hAnsi="Times New Roman"/>
           <w:lang w:val="uk-UA"/>
         </w:rPr>
-        <w:t xml:space="preserve">до тестбенча (модуль </w:t>
+        <w:t xml:space="preserve">до </w:t>
+      </w:r>
+      <w:proofErr w:type="spellStart"/>
+      <w:r>
+        <w:rPr>
+          <w:rFonts w:ascii="Times New Roman" w:hAnsi="Times New Roman"/>
+          <w:lang w:val="uk-UA"/>
+        </w:rPr>
+        <w:t>тестбенча</w:t>
+      </w:r>
+      <w:proofErr w:type="spellEnd"/>
+      <w:r>
+        <w:rPr>
+          <w:rFonts w:ascii="Times New Roman" w:hAnsi="Times New Roman"/>
+          <w:lang w:val="uk-UA"/>
+        </w:rPr>
+        <w:t xml:space="preserve"> (модуль </w:t>
       </w:r>
       <w:r>
         <w:rPr>
@@ -640,11 +885,12 @@
       <w:pPr>
         <w:pStyle w:val="Heading1"/>
       </w:pPr>
+      <w:bookmarkStart w:id="3" w:name="_Toc234932886"/>
       <w:r>
         <w:lastRenderedPageBreak/>
         <w:t>Theory</w:t>
       </w:r>
-      <w:bookmarkEnd w:id="0"/>
+      <w:bookmarkEnd w:id="3"/>
     </w:p>
     <w:p/>
     <w:p>
@@ -720,10 +966,12 @@
       <w:pPr>
         <w:pStyle w:val="Heading1"/>
       </w:pPr>
+      <w:bookmarkStart w:id="4" w:name="_Toc234932887"/>
       <w:r>
         <w:lastRenderedPageBreak/>
         <w:t>Simulation results</w:t>
       </w:r>
+      <w:bookmarkEnd w:id="4"/>
     </w:p>
     <w:p>
       <w:pPr>
@@ -963,6 +1211,7 @@
           <w:lang w:val="uk-UA"/>
         </w:rPr>
       </w:pPr>
+      <w:bookmarkStart w:id="5" w:name="_Toc234932888"/>
       <w:r>
         <w:rPr>
           <w:lang w:val="uk-UA"/>
@@ -970,6 +1219,7 @@
         <w:lastRenderedPageBreak/>
         <w:t>Індивідуальні завдання</w:t>
       </w:r>
+      <w:bookmarkEnd w:id="5"/>
     </w:p>
     <w:p>
       <w:pPr>
@@ -1265,8 +1515,36 @@
           <w:sz w:val="24"/>
           <w:lang w:val="uk-UA"/>
         </w:rPr>
-        <w:t>2) Записати таблицю істиності вручну для модуля top_design</w:t>
-      </w:r>
+        <w:t xml:space="preserve">2) Записати таблицю </w:t>
+      </w:r>
+      <w:proofErr w:type="spellStart"/>
+      <w:r>
+        <w:rPr>
+          <w:rFonts w:ascii="Times New Roman" w:hAnsi="Times New Roman"/>
+          <w:sz w:val="24"/>
+          <w:lang w:val="uk-UA"/>
+        </w:rPr>
+        <w:t>істиності</w:t>
+      </w:r>
+      <w:proofErr w:type="spellEnd"/>
+      <w:r>
+        <w:rPr>
+          <w:rFonts w:ascii="Times New Roman" w:hAnsi="Times New Roman"/>
+          <w:sz w:val="24"/>
+          <w:lang w:val="uk-UA"/>
+        </w:rPr>
+        <w:t xml:space="preserve"> вручну для модуля </w:t>
+      </w:r>
+      <w:proofErr w:type="spellStart"/>
+      <w:r>
+        <w:rPr>
+          <w:rFonts w:ascii="Times New Roman" w:hAnsi="Times New Roman"/>
+          <w:sz w:val="24"/>
+          <w:lang w:val="uk-UA"/>
+        </w:rPr>
+        <w:t>top_design</w:t>
+      </w:r>
+      <w:proofErr w:type="spellEnd"/>
       <w:r>
         <w:rPr>
           <w:rFonts w:ascii="Times New Roman" w:hAnsi="Times New Roman"/>
@@ -1344,8 +1622,54 @@
           <w:sz w:val="24"/>
           <w:lang w:val="uk-UA"/>
         </w:rPr>
-        <w:t>3) Створити тест бенч для модуля top_design та перевірити таблицю істиності</w:t>
-      </w:r>
+        <w:t xml:space="preserve">3) Створити тест </w:t>
+      </w:r>
+      <w:proofErr w:type="spellStart"/>
+      <w:r>
+        <w:rPr>
+          <w:rFonts w:ascii="Times New Roman" w:hAnsi="Times New Roman"/>
+          <w:sz w:val="24"/>
+          <w:lang w:val="uk-UA"/>
+        </w:rPr>
+        <w:t>бенч</w:t>
+      </w:r>
+      <w:proofErr w:type="spellEnd"/>
+      <w:r>
+        <w:rPr>
+          <w:rFonts w:ascii="Times New Roman" w:hAnsi="Times New Roman"/>
+          <w:sz w:val="24"/>
+          <w:lang w:val="uk-UA"/>
+        </w:rPr>
+        <w:t xml:space="preserve"> для модуля </w:t>
+      </w:r>
+      <w:proofErr w:type="spellStart"/>
+      <w:r>
+        <w:rPr>
+          <w:rFonts w:ascii="Times New Roman" w:hAnsi="Times New Roman"/>
+          <w:sz w:val="24"/>
+          <w:lang w:val="uk-UA"/>
+        </w:rPr>
+        <w:t>top_design</w:t>
+      </w:r>
+      <w:proofErr w:type="spellEnd"/>
+      <w:r>
+        <w:rPr>
+          <w:rFonts w:ascii="Times New Roman" w:hAnsi="Times New Roman"/>
+          <w:sz w:val="24"/>
+          <w:lang w:val="uk-UA"/>
+        </w:rPr>
+        <w:t xml:space="preserve"> та перевірити таблицю </w:t>
+      </w:r>
+      <w:proofErr w:type="spellStart"/>
+      <w:r>
+        <w:rPr>
+          <w:rFonts w:ascii="Times New Roman" w:hAnsi="Times New Roman"/>
+          <w:sz w:val="24"/>
+          <w:lang w:val="uk-UA"/>
+        </w:rPr>
+        <w:t>істиності</w:t>
+      </w:r>
+      <w:proofErr w:type="spellEnd"/>
       <w:r>
         <w:rPr>
           <w:rFonts w:ascii="Times New Roman" w:hAnsi="Times New Roman"/>

</xml_diff>